<commit_message>
add till 0526 -v2
</commit_message>
<xml_diff>
--- a/mac539/wk13_0527/hw11/MAC539-HW11-2025020399-송종빈.docx
+++ b/mac539/wk13_0527/hw11/MAC539-HW11-2025020399-송종빈.docx
@@ -142,7 +142,23 @@
           <w:sz w:val="20"/>
           <w:szCs w:val="22"/>
         </w:rPr>
-        <w:t xml:space="preserve"> 독점하면서 양상은 완전히 달라졌다. Farrell(2025)이 지적하듯, AI는 개별 인간 지능의 모방을 넘어 정보 분류와 사회 조정을 수행하는 '거버넌스의 기술(technology of governance)'이자 그 자체로 새로운 '거버넌스의 형태(form of governance)'로 작동하고 있다.</w:t>
+        <w:t xml:space="preserve"> 독점하면서 양상은 완전히 달라졌다. Farrell</w:t>
+      </w:r>
+      <w:r>
+        <w:rPr>
+          <w:rFonts w:asciiTheme="minorEastAsia" w:hAnsiTheme="minorEastAsia" w:hint="eastAsia"/>
+          <w:sz w:val="20"/>
+          <w:szCs w:val="22"/>
+        </w:rPr>
+        <w:t xml:space="preserve"> </w:t>
+      </w:r>
+      <w:r>
+        <w:rPr>
+          <w:rFonts w:asciiTheme="minorEastAsia" w:hAnsiTheme="minorEastAsia"/>
+          <w:sz w:val="20"/>
+          <w:szCs w:val="22"/>
+        </w:rPr>
+        <w:t>(2025)이 지적하듯, AI는 개별 인간 지능의 모방을 넘어 정보 분류와 사회 조정을 수행하는 '거버넌스의 기술(technology of governance)'이자 그 자체로 새로운 '거버넌스의 형태(form of governance)'로 작동하고 있다.</w:t>
       </w:r>
     </w:p>
     <w:p>
@@ -211,7 +227,7 @@
           <w:sz w:val="20"/>
           <w:szCs w:val="22"/>
         </w:rPr>
-        <w:t xml:space="preserve"> 실증 연구는 추천 알고리즘이 반민주적 태도 및 당파적 </w:t>
+        <w:t xml:space="preserve"> 연구는 추천 알고리즘이 반민주적 태도 및 당파적 </w:t>
       </w:r>
       <w:proofErr w:type="gramStart"/>
       <w:r>
@@ -229,43 +245,7 @@
           <w:sz w:val="20"/>
           <w:szCs w:val="22"/>
         </w:rPr>
-        <w:t xml:space="preserve">AAPA)을 담은 콘텐츠의 노출을 늘릴 때 사용자의 정서적 </w:t>
-      </w:r>
-      <w:proofErr w:type="gramStart"/>
-      <w:r>
-        <w:rPr>
-          <w:rFonts w:asciiTheme="minorEastAsia" w:hAnsiTheme="minorEastAsia"/>
-          <w:sz w:val="20"/>
-          <w:szCs w:val="22"/>
-        </w:rPr>
-        <w:t>양극화(</w:t>
-      </w:r>
-      <w:proofErr w:type="gramEnd"/>
-      <w:r>
-        <w:rPr>
-          <w:rFonts w:asciiTheme="minorEastAsia" w:hAnsiTheme="minorEastAsia"/>
-          <w:sz w:val="20"/>
-          <w:szCs w:val="22"/>
-        </w:rPr>
-        <w:t xml:space="preserve">affective </w:t>
-      </w:r>
-      <w:proofErr w:type="gramStart"/>
-      <w:r>
-        <w:rPr>
-          <w:rFonts w:asciiTheme="minorEastAsia" w:hAnsiTheme="minorEastAsia"/>
-          <w:sz w:val="20"/>
-          <w:szCs w:val="22"/>
-        </w:rPr>
-        <w:t>polarization)가</w:t>
-      </w:r>
-      <w:proofErr w:type="gramEnd"/>
-      <w:r>
-        <w:rPr>
-          <w:rFonts w:asciiTheme="minorEastAsia" w:hAnsiTheme="minorEastAsia"/>
-          <w:sz w:val="20"/>
-          <w:szCs w:val="22"/>
-        </w:rPr>
-        <w:t xml:space="preserve"> 직접적으로 악화됨을 증명했다. 사람들은 진실 착각 효과(illusory truth effects)나 감정적으로 자극적인 정보에 쉽게 반응하며, 알고리즘은 참여도(engagement)를 극대화하기 위해 이러한 자극을 반복 노출함으로써 '신념의 메아리(belief echoing)'와 허위정보 수용을 부추긴다. 즉, 알고리즘은 집단 내의 산발적인 오해나 편견을 체계적으로 </w:t>
+        <w:t xml:space="preserve">AAPA)을 담은 콘텐츠의 노출을 늘릴 때 사용자의 정서적 양극화가 직접적으로 악화됨을 증명했다. 사람들은 진실 착각 효과(illusory truth effects)나 감정적으로 자극적인 정보에 쉽게 반응하며, 알고리즘은 참여도를 극대화하기 위해 이러한 자극을 반복 노출함으로써 '신념의 메아리(belief echoing)'와 허위정보 수용을 부추긴다. 즉, 알고리즘은 집단 내의 산발적인 오해나 편견을 체계적으로 </w:t>
       </w:r>
       <w:proofErr w:type="spellStart"/>
       <w:r>
@@ -289,18 +269,18 @@
     <w:p>
       <w:pPr>
         <w:rPr>
-          <w:rFonts w:asciiTheme="minorEastAsia" w:hAnsiTheme="minorEastAsia" w:hint="eastAsia"/>
-          <w:sz w:val="20"/>
-          <w:szCs w:val="22"/>
-        </w:rPr>
-      </w:pPr>
-      <w:r>
-        <w:rPr>
-          <w:rFonts w:asciiTheme="minorEastAsia" w:hAnsiTheme="minorEastAsia"/>
-          <w:sz w:val="20"/>
-          <w:szCs w:val="22"/>
-        </w:rPr>
-        <w:t>그러나 역설적으로 AI는 이러한 민주주의의 위기를 극복할 새로운 '거버넌스의 형태'가 될 잠재력 또한 지니고 있다. Tessler et al.</w:t>
+          <w:rFonts w:asciiTheme="minorEastAsia" w:hAnsiTheme="minorEastAsia"/>
+          <w:sz w:val="20"/>
+          <w:szCs w:val="22"/>
+        </w:rPr>
+      </w:pPr>
+      <w:r>
+        <w:rPr>
+          <w:rFonts w:asciiTheme="minorEastAsia" w:hAnsiTheme="minorEastAsia"/>
+          <w:sz w:val="20"/>
+          <w:szCs w:val="22"/>
+        </w:rPr>
+        <w:t>그러나 역설적으로 AI는 이러한 민주주의의 위기를 극복할 새로운 거버넌스의 형태가 될 잠재력 또한 지니고 있다. Tessler et al.</w:t>
       </w:r>
       <w:r>
         <w:rPr>
@@ -478,7 +458,7 @@
           <w:sz w:val="20"/>
           <w:szCs w:val="22"/>
         </w:rPr>
-        <w:t xml:space="preserve"> 개별 참여자들의 의견과 비판을 종합하여 다수의 입장을 존중하면서도 소수의 의견에 가중치를 두어 공정한 타협안(공통 기반, common ground)을 도출한다. AI를 통한 숙의 과정은 단순히 서로의 의견에 노출되는 것을 넘어, 참여자들의 관점을 수렴하게 </w:t>
+        <w:t xml:space="preserve"> 개별 참여자들의 의견과 비판을 종합하여 다수의 입장을 존중하면서도 소수의 의견에 가중치를 두어 공정한 타협안(common ground)을 도출한다. AI를 통한 숙의 과정은 단순히 서로의 의견에 노출되는 것을 넘어, 참여자들의 관점을 수렴하게 </w:t>
       </w:r>
       <w:proofErr w:type="gramStart"/>
       <w:r>
@@ -496,7 +476,39 @@
           <w:sz w:val="20"/>
           <w:szCs w:val="22"/>
         </w:rPr>
-        <w:t xml:space="preserve"> 집단 내 분열을 유의미하게 감소시켰다. 결론적으로 세 연구와 10주차 논의를 종합하면, AI는 허위정보와 양극화를 증폭시키는 인지적 함정의 촉매제로 쓰일 수도 있지만, 알고리즘의 최적화 목표(objective function)를 민주적 합의와 공통 기반 도출로 재설정한다면 다원화된 사회의 합리적 의사결정을 돕는 강력한 인프라로 기능할 수 있다.</w:t>
+        <w:t xml:space="preserve"> 집단 내 분열을 유의미하게 감소시켰다. 결론적으로 세 연구</w:t>
+      </w:r>
+      <w:r>
+        <w:rPr>
+          <w:rFonts w:asciiTheme="minorEastAsia" w:hAnsiTheme="minorEastAsia" w:hint="eastAsia"/>
+          <w:sz w:val="20"/>
+          <w:szCs w:val="22"/>
+        </w:rPr>
+        <w:t>의</w:t>
+      </w:r>
+      <w:r>
+        <w:rPr>
+          <w:rFonts w:asciiTheme="minorEastAsia" w:hAnsiTheme="minorEastAsia"/>
+          <w:sz w:val="20"/>
+          <w:szCs w:val="22"/>
+        </w:rPr>
+        <w:t xml:space="preserve"> 논의를 종합하면, AI는 허위정보와 양극화를 증폭시키는 </w:t>
+      </w:r>
+      <w:r>
+        <w:rPr>
+          <w:rFonts w:asciiTheme="minorEastAsia" w:hAnsiTheme="minorEastAsia" w:hint="eastAsia"/>
+          <w:sz w:val="20"/>
+          <w:szCs w:val="22"/>
+        </w:rPr>
+        <w:t>부정적인</w:t>
+      </w:r>
+      <w:r>
+        <w:rPr>
+          <w:rFonts w:asciiTheme="minorEastAsia" w:hAnsiTheme="minorEastAsia"/>
+          <w:sz w:val="20"/>
+          <w:szCs w:val="22"/>
+        </w:rPr>
+        <w:t xml:space="preserve"> 촉매제로 쓰일 수도 있지만, 알고리즘의 최적화 목표를 민주적 합의와 공통 기반 도출로 재설정한다면 다원화된 사회의 합리적 의사결정을 돕는 강력한 인프라로 기능할 수 있다.</w:t>
       </w:r>
     </w:p>
     <w:p>
@@ -544,57 +556,130 @@
           <w:sz w:val="20"/>
           <w:szCs w:val="22"/>
         </w:rPr>
-        <w:t xml:space="preserve">이번 주 문헌들은 </w:t>
+        <w:t>이번 주 문헌들</w:t>
+      </w:r>
+      <w:r>
+        <w:rPr>
+          <w:rFonts w:asciiTheme="minorEastAsia" w:hAnsiTheme="minorEastAsia" w:hint="eastAsia"/>
+          <w:sz w:val="20"/>
+          <w:szCs w:val="22"/>
+        </w:rPr>
+        <w:t xml:space="preserve"> 중 인상깊게 읽었던 논문은 </w:t>
       </w:r>
       <w:proofErr w:type="spellStart"/>
       <w:r>
         <w:rPr>
-          <w:rFonts w:asciiTheme="minorEastAsia" w:hAnsiTheme="minorEastAsia"/>
-          <w:sz w:val="20"/>
-          <w:szCs w:val="22"/>
-        </w:rPr>
-        <w:t>인플루언서의</w:t>
+          <w:rFonts w:asciiTheme="minorEastAsia" w:hAnsiTheme="minorEastAsia" w:hint="eastAsia"/>
+          <w:sz w:val="20"/>
+          <w:szCs w:val="22"/>
+        </w:rPr>
+        <w:t>Piccardi</w:t>
       </w:r>
       <w:proofErr w:type="spellEnd"/>
       <w:r>
         <w:rPr>
-          <w:rFonts w:asciiTheme="minorEastAsia" w:hAnsiTheme="minorEastAsia"/>
-          <w:sz w:val="20"/>
-          <w:szCs w:val="22"/>
-        </w:rPr>
-        <w:t xml:space="preserve"> 정치적 효과를 입체적으로 조명했</w:t>
-      </w:r>
-      <w:r>
-        <w:rPr>
-          <w:rFonts w:asciiTheme="minorEastAsia" w:hAnsiTheme="minorEastAsia" w:hint="eastAsia"/>
-          <w:sz w:val="20"/>
-          <w:szCs w:val="22"/>
-        </w:rPr>
-        <w:t xml:space="preserve">고 매우 흥미로웠다. </w:t>
-      </w:r>
-      <w:r>
-        <w:rPr>
-          <w:rFonts w:asciiTheme="minorEastAsia" w:hAnsiTheme="minorEastAsia" w:hint="eastAsia"/>
-          <w:sz w:val="20"/>
-          <w:szCs w:val="22"/>
-        </w:rPr>
-        <w:t xml:space="preserve">이에 대해 나만의 시각으로 </w:t>
-      </w:r>
-      <w:r>
-        <w:rPr>
-          <w:rFonts w:asciiTheme="minorEastAsia" w:hAnsiTheme="minorEastAsia" w:hint="eastAsia"/>
-          <w:sz w:val="20"/>
-          <w:szCs w:val="22"/>
-        </w:rPr>
-        <w:t>조금 더 깊게 한번 사유</w:t>
-      </w:r>
-      <w:r>
-        <w:rPr>
-          <w:rFonts w:asciiTheme="minorEastAsia" w:hAnsiTheme="minorEastAsia" w:hint="eastAsia"/>
-          <w:sz w:val="20"/>
-          <w:szCs w:val="22"/>
-        </w:rPr>
-        <w:t>하고 여러 가설을 도출해보았다.</w:t>
+          <w:rFonts w:asciiTheme="minorEastAsia" w:hAnsiTheme="minorEastAsia" w:hint="eastAsia"/>
+          <w:sz w:val="20"/>
+          <w:szCs w:val="22"/>
+        </w:rPr>
+        <w:t xml:space="preserve"> et al. (2025)가 소셜 미디어 플랫폼 기업의 허락이나 협조 없이도 연구자들이 독립적으로 추천 알고리즘을 조작하고 실험할 수 있는 기술적인 방법론을 구현한 시도였다. 이 </w:t>
+      </w:r>
+      <w:r>
+        <w:rPr>
+          <w:rFonts w:asciiTheme="minorEastAsia" w:hAnsiTheme="minorEastAsia" w:hint="eastAsia"/>
+          <w:sz w:val="20"/>
+          <w:szCs w:val="22"/>
+        </w:rPr>
+        <w:t>브라우저 확장 프로그램을 통한</w:t>
+      </w:r>
+      <w:r>
+        <w:rPr>
+          <w:rFonts w:asciiTheme="minorEastAsia" w:hAnsiTheme="minorEastAsia" w:hint="eastAsia"/>
+          <w:sz w:val="20"/>
+          <w:szCs w:val="22"/>
+        </w:rPr>
+        <w:t xml:space="preserve"> </w:t>
+      </w:r>
+      <w:proofErr w:type="spellStart"/>
+      <w:r>
+        <w:rPr>
+          <w:rFonts w:asciiTheme="minorEastAsia" w:hAnsiTheme="minorEastAsia" w:hint="eastAsia"/>
+          <w:sz w:val="20"/>
+          <w:szCs w:val="22"/>
+        </w:rPr>
+        <w:t>피드</w:t>
+      </w:r>
+      <w:proofErr w:type="spellEnd"/>
+      <w:r>
+        <w:rPr>
+          <w:rFonts w:asciiTheme="minorEastAsia" w:hAnsiTheme="minorEastAsia" w:hint="eastAsia"/>
+          <w:sz w:val="20"/>
+          <w:szCs w:val="22"/>
+        </w:rPr>
+        <w:t xml:space="preserve"> 재정렬 방식은 X, Facebook 등 외에도 유튜브나 온라인에 게재된 레거시 언론사들의 뉴스 홈 화면 등에도 적용하</w:t>
+      </w:r>
+      <w:r>
+        <w:rPr>
+          <w:rFonts w:asciiTheme="minorEastAsia" w:hAnsiTheme="minorEastAsia" w:hint="eastAsia"/>
+          <w:sz w:val="20"/>
+          <w:szCs w:val="22"/>
+        </w:rPr>
+        <w:lastRenderedPageBreak/>
+        <w:t xml:space="preserve">여 다양한 인과적 관계들을 살펴볼 수 있을 것 같아, 이를 바탕으로 한 후속연구에 관심이 간다. 또한 자기 </w:t>
+      </w:r>
+      <w:proofErr w:type="spellStart"/>
+      <w:r>
+        <w:rPr>
+          <w:rFonts w:asciiTheme="minorEastAsia" w:hAnsiTheme="minorEastAsia" w:hint="eastAsia"/>
+          <w:sz w:val="20"/>
+          <w:szCs w:val="22"/>
+        </w:rPr>
+        <w:t>강화적</w:t>
+      </w:r>
+      <w:proofErr w:type="spellEnd"/>
+      <w:r>
+        <w:rPr>
+          <w:rFonts w:asciiTheme="minorEastAsia" w:hAnsiTheme="minorEastAsia" w:hint="eastAsia"/>
+          <w:sz w:val="20"/>
+          <w:szCs w:val="22"/>
+        </w:rPr>
+        <w:t xml:space="preserve"> 참여루프(self-reinforcing engagement loop)의 개념을 가져왔는데, 이번주 발제에서도 </w:t>
+      </w:r>
+      <w:proofErr w:type="spellStart"/>
+      <w:r>
+        <w:rPr>
+          <w:rFonts w:asciiTheme="minorEastAsia" w:hAnsiTheme="minorEastAsia" w:hint="eastAsia"/>
+          <w:sz w:val="20"/>
+          <w:szCs w:val="22"/>
+        </w:rPr>
+        <w:t>주의깊게</w:t>
+      </w:r>
+      <w:proofErr w:type="spellEnd"/>
+      <w:r>
+        <w:rPr>
+          <w:rFonts w:asciiTheme="minorEastAsia" w:hAnsiTheme="minorEastAsia" w:hint="eastAsia"/>
+          <w:sz w:val="20"/>
+          <w:szCs w:val="22"/>
+        </w:rPr>
+        <w:t xml:space="preserve"> 다룰 내용이기도 해서 세 논문들 중에서도 특히나 더 재밌게 읽었던 것 같다. 마지막으로, 정서적 양극화에 대해서만 다룬 것이 아니라, AAPA 콘텐츠를 줄이면 소셜미디어 플랫폼의 체류 시간이 감소하고 조회수나 </w:t>
+      </w:r>
+      <w:proofErr w:type="spellStart"/>
+      <w:r>
+        <w:rPr>
+          <w:rFonts w:asciiTheme="minorEastAsia" w:hAnsiTheme="minorEastAsia" w:hint="eastAsia"/>
+          <w:sz w:val="20"/>
+          <w:szCs w:val="22"/>
+        </w:rPr>
+        <w:t>좋아요도</w:t>
+      </w:r>
+      <w:proofErr w:type="spellEnd"/>
+      <w:r>
+        <w:rPr>
+          <w:rFonts w:asciiTheme="minorEastAsia" w:hAnsiTheme="minorEastAsia" w:hint="eastAsia"/>
+          <w:sz w:val="20"/>
+          <w:szCs w:val="22"/>
+        </w:rPr>
+        <w:t xml:space="preserve"> 줄어드는 것까지 실증한 것이 너무나 흥미로웠다.</w:t>
       </w:r>
     </w:p>
     <w:p>
@@ -605,14 +690,16 @@
           <w:szCs w:val="22"/>
         </w:rPr>
       </w:pPr>
-      <w:r>
-        <w:rPr>
-          <w:rFonts w:asciiTheme="minorEastAsia" w:hAnsiTheme="minorEastAsia"/>
-          <w:sz w:val="20"/>
-          <w:szCs w:val="22"/>
-        </w:rPr>
-        <w:t>첫째,</w:t>
-      </w:r>
+      <w:proofErr w:type="spellStart"/>
+      <w:r>
+        <w:rPr>
+          <w:rFonts w:asciiTheme="minorEastAsia" w:hAnsiTheme="minorEastAsia" w:hint="eastAsia"/>
+          <w:sz w:val="20"/>
+          <w:szCs w:val="22"/>
+        </w:rPr>
+        <w:t>하버마스</w:t>
+      </w:r>
+      <w:proofErr w:type="spellEnd"/>
       <w:r>
         <w:rPr>
           <w:rFonts w:asciiTheme="minorEastAsia" w:hAnsiTheme="minorEastAsia" w:hint="eastAsia"/>
@@ -621,326 +708,67 @@
         </w:rPr>
         <w:t xml:space="preserve"> </w:t>
       </w:r>
-      <w:r>
-        <w:rPr>
-          <w:rFonts w:asciiTheme="minorEastAsia" w:hAnsiTheme="minorEastAsia"/>
-          <w:sz w:val="20"/>
-          <w:szCs w:val="22"/>
-        </w:rPr>
-        <w:t xml:space="preserve">디지털 공론장에서 </w:t>
-      </w:r>
       <w:proofErr w:type="spellStart"/>
       <w:r>
         <w:rPr>
-          <w:rFonts w:asciiTheme="minorEastAsia" w:hAnsiTheme="minorEastAsia"/>
-          <w:sz w:val="20"/>
-          <w:szCs w:val="22"/>
-        </w:rPr>
-        <w:t>인플루언서</w:t>
+          <w:rFonts w:asciiTheme="minorEastAsia" w:hAnsiTheme="minorEastAsia" w:hint="eastAsia"/>
+          <w:sz w:val="20"/>
+          <w:szCs w:val="22"/>
+        </w:rPr>
+        <w:t>머신의</w:t>
       </w:r>
       <w:proofErr w:type="spellEnd"/>
       <w:r>
         <w:rPr>
-          <w:rFonts w:asciiTheme="minorEastAsia" w:hAnsiTheme="minorEastAsia"/>
-          <w:sz w:val="20"/>
-          <w:szCs w:val="22"/>
-        </w:rPr>
-        <w:t xml:space="preserve"> 간의 담합은 단순한 알고리즘 조작을 넘어 '참조의 사슬(Chain of Reference)'을 통한 신뢰도의 인위적 증폭으로</w:t>
-      </w:r>
-      <w:r>
-        <w:rPr>
-          <w:rFonts w:asciiTheme="minorEastAsia" w:hAnsiTheme="minorEastAsia" w:hint="eastAsia"/>
-          <w:sz w:val="20"/>
-          <w:szCs w:val="22"/>
-        </w:rPr>
-        <w:t>도 볼 수 있을 것 같</w:t>
-      </w:r>
-      <w:r>
-        <w:rPr>
-          <w:rFonts w:asciiTheme="minorEastAsia" w:hAnsiTheme="minorEastAsia"/>
-          <w:sz w:val="20"/>
-          <w:szCs w:val="22"/>
-        </w:rPr>
-        <w:t>다. Goodwin et al.</w:t>
-      </w:r>
-      <w:r>
-        <w:rPr>
-          <w:rFonts w:asciiTheme="minorEastAsia" w:hAnsiTheme="minorEastAsia" w:hint="eastAsia"/>
-          <w:sz w:val="20"/>
-          <w:szCs w:val="22"/>
-        </w:rPr>
-        <w:t xml:space="preserve"> </w:t>
-      </w:r>
-      <w:r>
-        <w:rPr>
-          <w:rFonts w:asciiTheme="minorEastAsia" w:hAnsiTheme="minorEastAsia"/>
-          <w:sz w:val="20"/>
-          <w:szCs w:val="22"/>
-        </w:rPr>
-        <w:lastRenderedPageBreak/>
-        <w:t>(</w:t>
-      </w:r>
-      <w:proofErr w:type="gramStart"/>
-      <w:r>
-        <w:rPr>
-          <w:rFonts w:asciiTheme="minorEastAsia" w:hAnsiTheme="minorEastAsia"/>
-          <w:sz w:val="20"/>
-          <w:szCs w:val="22"/>
-        </w:rPr>
-        <w:t>2023)은</w:t>
-      </w:r>
-      <w:proofErr w:type="gramEnd"/>
-      <w:r>
-        <w:rPr>
-          <w:rFonts w:asciiTheme="minorEastAsia" w:hAnsiTheme="minorEastAsia"/>
-          <w:sz w:val="20"/>
-          <w:szCs w:val="22"/>
-        </w:rPr>
-        <w:t xml:space="preserve"> </w:t>
+          <w:rFonts w:asciiTheme="minorEastAsia" w:hAnsiTheme="minorEastAsia" w:hint="eastAsia"/>
+          <w:sz w:val="20"/>
+          <w:szCs w:val="22"/>
+        </w:rPr>
+        <w:t xml:space="preserve"> 경우에는 전에 정치커뮤니케이션 수업에서도 언급이 되었던 내용이고, 예전에도 한번 읽어보았던 연구이다. 다시 봐도 매우 흥미로웠고, 처음 대학원에 입학하며 </w:t>
       </w:r>
       <w:proofErr w:type="spellStart"/>
       <w:r>
         <w:rPr>
-          <w:rFonts w:asciiTheme="minorEastAsia" w:hAnsiTheme="minorEastAsia"/>
-          <w:sz w:val="20"/>
-          <w:szCs w:val="22"/>
-        </w:rPr>
-        <w:t>틱톡의</w:t>
+          <w:rFonts w:asciiTheme="minorEastAsia" w:hAnsiTheme="minorEastAsia" w:hint="eastAsia"/>
+          <w:sz w:val="20"/>
+          <w:szCs w:val="22"/>
+        </w:rPr>
+        <w:t>의회식</w:t>
       </w:r>
       <w:proofErr w:type="spellEnd"/>
       <w:r>
         <w:rPr>
-          <w:rFonts w:asciiTheme="minorEastAsia" w:hAnsiTheme="minorEastAsia"/>
-          <w:sz w:val="20"/>
-          <w:szCs w:val="22"/>
-        </w:rPr>
-        <w:t xml:space="preserve"> </w:t>
+          <w:rFonts w:asciiTheme="minorEastAsia" w:hAnsiTheme="minorEastAsia" w:hint="eastAsia"/>
+          <w:sz w:val="20"/>
+          <w:szCs w:val="22"/>
+        </w:rPr>
+        <w:t xml:space="preserve"> 토론을 기반으로 한 의사결정과정에서 활용될 수 있는 모델에 대해 연구계획서에 작성한 적 있었다. 그때는 잘 모르고 작성하였는데, 실질적으로 그 효과를 입증하고, 개인화된 보상모델(Personalized Reward Model, PRM)이라는 아이디어를 통해 구현한 과정이 너무나 흥미롭게 읽혔다. </w:t>
+      </w:r>
+      <w:r>
+        <w:rPr>
+          <w:rFonts w:asciiTheme="minorEastAsia" w:hAnsiTheme="minorEastAsia" w:hint="eastAsia"/>
+          <w:sz w:val="20"/>
+          <w:szCs w:val="22"/>
+        </w:rPr>
+        <w:t xml:space="preserve">또한, 다수결을 그대로 밀어붙이는 것이 아니라 소수의 의견을 선언문에 잘 통합시키는 방향성이 매우 인상깊었다. 다만 연구의 한계에서 밝힌 여러 </w:t>
       </w:r>
       <w:proofErr w:type="spellStart"/>
       <w:r>
         <w:rPr>
-          <w:rFonts w:asciiTheme="minorEastAsia" w:hAnsiTheme="minorEastAsia"/>
-          <w:sz w:val="20"/>
-          <w:szCs w:val="22"/>
-        </w:rPr>
-        <w:t>하이프</w:t>
+          <w:rFonts w:asciiTheme="minorEastAsia" w:hAnsiTheme="minorEastAsia" w:hint="eastAsia"/>
+          <w:sz w:val="20"/>
+          <w:szCs w:val="22"/>
+        </w:rPr>
+        <w:t>팩트체킹이나</w:t>
       </w:r>
       <w:proofErr w:type="spellEnd"/>
       <w:r>
         <w:rPr>
-          <w:rFonts w:asciiTheme="minorEastAsia" w:hAnsiTheme="minorEastAsia"/>
-          <w:sz w:val="20"/>
-          <w:szCs w:val="22"/>
-        </w:rPr>
-        <w:t xml:space="preserve"> 하우스나 참여 포드에서 </w:t>
-      </w:r>
-      <w:proofErr w:type="spellStart"/>
-      <w:r>
-        <w:rPr>
-          <w:rFonts w:asciiTheme="minorEastAsia" w:hAnsiTheme="minorEastAsia"/>
-          <w:sz w:val="20"/>
-          <w:szCs w:val="22"/>
-        </w:rPr>
-        <w:t>인플루언서들이</w:t>
-      </w:r>
-      <w:proofErr w:type="spellEnd"/>
-      <w:r>
-        <w:rPr>
-          <w:rFonts w:asciiTheme="minorEastAsia" w:hAnsiTheme="minorEastAsia"/>
-          <w:sz w:val="20"/>
-          <w:szCs w:val="22"/>
-        </w:rPr>
-        <w:t xml:space="preserve"> 위계적 구조를 갖추고 조직적으로 '좋아요'와 공유를 교환한다고 지적한다. 수용자들은 정보의 홍수 속에서 메시지의 신뢰성을 평가하기 위해 '전달자의 평판'이라는 휴리스틱에 의존한다. 이때 </w:t>
-      </w:r>
-      <w:proofErr w:type="spellStart"/>
-      <w:r>
-        <w:rPr>
-          <w:rFonts w:asciiTheme="minorEastAsia" w:hAnsiTheme="minorEastAsia"/>
-          <w:sz w:val="20"/>
-          <w:szCs w:val="22"/>
-        </w:rPr>
-        <w:t>인플루언서</w:t>
-      </w:r>
-      <w:proofErr w:type="spellEnd"/>
-      <w:r>
-        <w:rPr>
-          <w:rFonts w:asciiTheme="minorEastAsia" w:hAnsiTheme="minorEastAsia"/>
-          <w:sz w:val="20"/>
-          <w:szCs w:val="22"/>
-        </w:rPr>
-        <w:t xml:space="preserve"> 네트워크가 서로의 콘텐츠에 동조하고 공유하는 행위는 알고리즘 노출도를 높일 뿐만 아니라, 서로를 인용하고 보증하는 '참조의 사슬'로 작동한다</w:t>
-      </w:r>
-      <w:r>
-        <w:rPr>
-          <w:rFonts w:asciiTheme="minorEastAsia" w:hAnsiTheme="minorEastAsia" w:hint="eastAsia"/>
-          <w:sz w:val="20"/>
-          <w:szCs w:val="22"/>
-        </w:rPr>
-        <w:t>고도 볼 수 있다</w:t>
-      </w:r>
-      <w:r>
-        <w:rPr>
-          <w:rFonts w:asciiTheme="minorEastAsia" w:hAnsiTheme="minorEastAsia"/>
-          <w:sz w:val="20"/>
-          <w:szCs w:val="22"/>
-        </w:rPr>
-        <w:t xml:space="preserve">. 여러 </w:t>
-      </w:r>
-      <w:proofErr w:type="spellStart"/>
-      <w:r>
-        <w:rPr>
-          <w:rFonts w:asciiTheme="minorEastAsia" w:hAnsiTheme="minorEastAsia"/>
-          <w:sz w:val="20"/>
-          <w:szCs w:val="22"/>
-        </w:rPr>
-        <w:t>인플루언서가</w:t>
-      </w:r>
-      <w:proofErr w:type="spellEnd"/>
-      <w:r>
-        <w:rPr>
-          <w:rFonts w:asciiTheme="minorEastAsia" w:hAnsiTheme="minorEastAsia"/>
-          <w:sz w:val="20"/>
-          <w:szCs w:val="22"/>
-        </w:rPr>
-        <w:t xml:space="preserve"> 동일한 이슈를 릴레이식으로 다루는 것은 수용자에게 반복 노출을 유발하며, Merz &amp; von Sikorski</w:t>
-      </w:r>
-      <w:r>
-        <w:rPr>
-          <w:rFonts w:asciiTheme="minorEastAsia" w:hAnsiTheme="minorEastAsia" w:hint="eastAsia"/>
-          <w:sz w:val="20"/>
-          <w:szCs w:val="22"/>
-        </w:rPr>
-        <w:t xml:space="preserve"> </w:t>
-      </w:r>
-      <w:r>
-        <w:rPr>
-          <w:rFonts w:asciiTheme="minorEastAsia" w:hAnsiTheme="minorEastAsia"/>
-          <w:sz w:val="20"/>
-          <w:szCs w:val="22"/>
-        </w:rPr>
-        <w:t xml:space="preserve">(2025)가 언급한 진실 효과(truth effect)와 정보 처리 유창성을 통해 메시지의 신뢰도를 급격히 높인다. 즉, </w:t>
-      </w:r>
-      <w:proofErr w:type="spellStart"/>
-      <w:r>
-        <w:rPr>
-          <w:rFonts w:asciiTheme="minorEastAsia" w:hAnsiTheme="minorEastAsia"/>
-          <w:sz w:val="20"/>
-          <w:szCs w:val="22"/>
-        </w:rPr>
-        <w:t>팔로워</w:t>
-      </w:r>
-      <w:proofErr w:type="spellEnd"/>
-      <w:r>
-        <w:rPr>
-          <w:rFonts w:asciiTheme="minorEastAsia" w:hAnsiTheme="minorEastAsia"/>
-          <w:sz w:val="20"/>
-          <w:szCs w:val="22"/>
-        </w:rPr>
-        <w:t xml:space="preserve"> 수가 권력이 된 계급 구조</w:t>
-      </w:r>
-      <w:r>
-        <w:rPr>
-          <w:rFonts w:asciiTheme="minorEastAsia" w:hAnsiTheme="minorEastAsia" w:hint="eastAsia"/>
-          <w:sz w:val="20"/>
-          <w:szCs w:val="22"/>
-        </w:rPr>
-        <w:t>로 플랫폼을 바라보고,</w:t>
-      </w:r>
-      <w:r>
-        <w:rPr>
-          <w:rFonts w:asciiTheme="minorEastAsia" w:hAnsiTheme="minorEastAsia"/>
-          <w:sz w:val="20"/>
-          <w:szCs w:val="22"/>
-        </w:rPr>
-        <w:t xml:space="preserve"> 특정 의제를 조직적으로 수면 위에 끌어올리는 행위는 </w:t>
-      </w:r>
-      <w:r>
-        <w:rPr>
-          <w:rFonts w:asciiTheme="minorEastAsia" w:hAnsiTheme="minorEastAsia" w:hint="eastAsia"/>
-          <w:sz w:val="20"/>
-          <w:szCs w:val="22"/>
-        </w:rPr>
-        <w:t xml:space="preserve">이러한 관점에서 </w:t>
-      </w:r>
-      <w:r>
-        <w:rPr>
-          <w:rFonts w:asciiTheme="minorEastAsia" w:hAnsiTheme="minorEastAsia"/>
-          <w:sz w:val="20"/>
-          <w:szCs w:val="22"/>
-        </w:rPr>
-        <w:t>수평적 여론 주도</w:t>
-      </w:r>
-      <w:r>
-        <w:rPr>
-          <w:rFonts w:asciiTheme="minorEastAsia" w:hAnsiTheme="minorEastAsia" w:hint="eastAsia"/>
-          <w:sz w:val="20"/>
-          <w:szCs w:val="22"/>
-        </w:rPr>
-        <w:t>가 아니라</w:t>
-      </w:r>
-      <w:r>
-        <w:rPr>
-          <w:rFonts w:asciiTheme="minorEastAsia" w:hAnsiTheme="minorEastAsia"/>
-          <w:sz w:val="20"/>
-          <w:szCs w:val="22"/>
-        </w:rPr>
-        <w:t xml:space="preserve"> 참조 빈도를 무기 삼아 대중</w:t>
-      </w:r>
-      <w:r>
-        <w:rPr>
-          <w:rFonts w:asciiTheme="minorEastAsia" w:hAnsiTheme="minorEastAsia" w:hint="eastAsia"/>
-          <w:sz w:val="20"/>
-          <w:szCs w:val="22"/>
-        </w:rPr>
-        <w:t>의 정보에 대한 신뢰 여부 판단 과정을</w:t>
-      </w:r>
-      <w:r>
-        <w:rPr>
-          <w:rFonts w:asciiTheme="minorEastAsia" w:hAnsiTheme="minorEastAsia"/>
-          <w:sz w:val="20"/>
-          <w:szCs w:val="22"/>
-        </w:rPr>
-        <w:t xml:space="preserve"> </w:t>
-      </w:r>
-      <w:r>
-        <w:rPr>
-          <w:rFonts w:asciiTheme="minorEastAsia" w:hAnsiTheme="minorEastAsia" w:hint="eastAsia"/>
-          <w:sz w:val="20"/>
-          <w:szCs w:val="22"/>
-        </w:rPr>
-        <w:t>조작</w:t>
-      </w:r>
-      <w:r>
-        <w:rPr>
-          <w:rFonts w:asciiTheme="minorEastAsia" w:hAnsiTheme="minorEastAsia"/>
-          <w:sz w:val="20"/>
-          <w:szCs w:val="22"/>
-        </w:rPr>
-        <w:t>하는</w:t>
-      </w:r>
-      <w:r>
-        <w:rPr>
-          <w:rFonts w:asciiTheme="minorEastAsia" w:hAnsiTheme="minorEastAsia" w:hint="eastAsia"/>
-          <w:sz w:val="20"/>
-          <w:szCs w:val="22"/>
-        </w:rPr>
-        <w:t xml:space="preserve"> 행위</w:t>
-      </w:r>
-      <w:r>
-        <w:rPr>
-          <w:rFonts w:asciiTheme="minorEastAsia" w:hAnsiTheme="minorEastAsia"/>
-          <w:sz w:val="20"/>
-          <w:szCs w:val="22"/>
-        </w:rPr>
-        <w:t>(astroturfing)</w:t>
-      </w:r>
-      <w:r>
-        <w:rPr>
-          <w:rFonts w:asciiTheme="minorEastAsia" w:hAnsiTheme="minorEastAsia" w:hint="eastAsia"/>
-          <w:sz w:val="20"/>
-          <w:szCs w:val="22"/>
-        </w:rPr>
-        <w:t>로 해석할 수 있다.</w:t>
+          <w:rFonts w:asciiTheme="minorEastAsia" w:hAnsiTheme="minorEastAsia" w:hint="eastAsia"/>
+          <w:sz w:val="20"/>
+          <w:szCs w:val="22"/>
+        </w:rPr>
+        <w:t xml:space="preserve"> 환각, 윤리적인 문제들로 인해 앞으로 더 개선되고 나아갈 방향은 남아있다고 느껴졌다.</w:t>
       </w:r>
     </w:p>
     <w:p>
@@ -953,244 +781,90 @@
       </w:pPr>
       <w:r>
         <w:rPr>
-          <w:rFonts w:asciiTheme="minorEastAsia" w:hAnsiTheme="minorEastAsia"/>
-          <w:sz w:val="20"/>
-          <w:szCs w:val="22"/>
-        </w:rPr>
-        <w:t xml:space="preserve">둘째, </w:t>
-      </w:r>
-      <w:r>
-        <w:rPr>
-          <w:rFonts w:asciiTheme="minorEastAsia" w:hAnsiTheme="minorEastAsia" w:hint="eastAsia"/>
-          <w:sz w:val="20"/>
-          <w:szCs w:val="22"/>
-        </w:rPr>
-        <w:t xml:space="preserve">이 관점을 적용해보면, </w:t>
+          <w:rFonts w:asciiTheme="minorEastAsia" w:hAnsiTheme="minorEastAsia" w:hint="eastAsia"/>
+          <w:sz w:val="20"/>
+          <w:szCs w:val="22"/>
+        </w:rPr>
+        <w:t xml:space="preserve">마지막으로 Farrell (2025)의 AI를 거버넌스, 즉 시스템으로 받아들이고 연구를 한다는 시각은 이 기술을 비인간 행위자로 규정하고 바라보는 내 기존의 시각과는 적지 않은 차이가 있었다. 그러나, 분명 거버넌스로 이를 받아들여 정치학에서 논의하는 것의 의의는 충분히 이해가 되었고, 이를 위해 사이먼의 인공물의 과학(sciences of the artificial) 틀을 가져온 것도 </w:t>
       </w:r>
       <w:proofErr w:type="spellStart"/>
       <w:r>
         <w:rPr>
-          <w:rFonts w:asciiTheme="minorEastAsia" w:hAnsiTheme="minorEastAsia"/>
-          <w:sz w:val="20"/>
-          <w:szCs w:val="22"/>
-        </w:rPr>
-        <w:t>인플루언서를</w:t>
+          <w:rFonts w:asciiTheme="minorEastAsia" w:hAnsiTheme="minorEastAsia" w:hint="eastAsia"/>
+          <w:sz w:val="20"/>
+          <w:szCs w:val="22"/>
+        </w:rPr>
+        <w:t>설득력있게</w:t>
       </w:r>
       <w:proofErr w:type="spellEnd"/>
       <w:r>
         <w:rPr>
-          <w:rFonts w:asciiTheme="minorEastAsia" w:hAnsiTheme="minorEastAsia"/>
-          <w:sz w:val="20"/>
-          <w:szCs w:val="22"/>
-        </w:rPr>
-        <w:t xml:space="preserve"> 통한 정치적 효능감 증폭은 이슈의 특수성, 즉 위기 상황이 촉발하는 '참조 사슬의 형성 속도와 양'</w:t>
-      </w:r>
-      <w:proofErr w:type="spellStart"/>
-      <w:r>
-        <w:rPr>
-          <w:rFonts w:asciiTheme="minorEastAsia" w:hAnsiTheme="minorEastAsia"/>
-          <w:sz w:val="20"/>
-          <w:szCs w:val="22"/>
-        </w:rPr>
-        <w:t>에</w:t>
-      </w:r>
-      <w:proofErr w:type="spellEnd"/>
-      <w:r>
-        <w:rPr>
-          <w:rFonts w:asciiTheme="minorEastAsia" w:hAnsiTheme="minorEastAsia"/>
-          <w:sz w:val="20"/>
-          <w:szCs w:val="22"/>
-        </w:rPr>
-        <w:t xml:space="preserve"> 절대적으로 의존하는 제한적 효과일 가능성이 크다. Goodwin et al.</w:t>
-      </w:r>
-      <w:r>
-        <w:rPr>
-          <w:rFonts w:asciiTheme="minorEastAsia" w:hAnsiTheme="minorEastAsia" w:hint="eastAsia"/>
-          <w:sz w:val="20"/>
-          <w:szCs w:val="22"/>
-        </w:rPr>
-        <w:t xml:space="preserve"> </w:t>
-      </w:r>
-      <w:r>
-        <w:rPr>
-          <w:rFonts w:asciiTheme="minorEastAsia" w:hAnsiTheme="minorEastAsia"/>
-          <w:sz w:val="20"/>
-          <w:szCs w:val="22"/>
-        </w:rPr>
-        <w:t>(</w:t>
-      </w:r>
-      <w:proofErr w:type="gramStart"/>
-      <w:r>
-        <w:rPr>
-          <w:rFonts w:asciiTheme="minorEastAsia" w:hAnsiTheme="minorEastAsia"/>
-          <w:sz w:val="20"/>
-          <w:szCs w:val="22"/>
-        </w:rPr>
-        <w:t>2023)은</w:t>
-      </w:r>
-      <w:proofErr w:type="gramEnd"/>
-      <w:r>
-        <w:rPr>
-          <w:rFonts w:asciiTheme="minorEastAsia" w:hAnsiTheme="minorEastAsia"/>
-          <w:sz w:val="20"/>
-          <w:szCs w:val="22"/>
-        </w:rPr>
-        <w:t xml:space="preserve"> </w:t>
-      </w:r>
-      <w:proofErr w:type="spellStart"/>
-      <w:r>
-        <w:rPr>
-          <w:rFonts w:asciiTheme="minorEastAsia" w:hAnsiTheme="minorEastAsia"/>
-          <w:sz w:val="20"/>
-          <w:szCs w:val="22"/>
-        </w:rPr>
-        <w:t>인플루언서가</w:t>
-      </w:r>
-      <w:proofErr w:type="spellEnd"/>
-      <w:r>
-        <w:rPr>
-          <w:rFonts w:asciiTheme="minorEastAsia" w:hAnsiTheme="minorEastAsia"/>
-          <w:sz w:val="20"/>
-          <w:szCs w:val="22"/>
-        </w:rPr>
-        <w:t xml:space="preserve"> 침묵을 깨고 정치에 관여하게 된 결정적 계기가 코로나19 팬데믹이나 BLM 시위 같은 거대한 사회적 위기였다고 밝힌다. 후보자 중심보다는 이러한 가치 및 이슈 기반 캠페인에서 </w:t>
-      </w:r>
-      <w:proofErr w:type="spellStart"/>
-      <w:r>
-        <w:rPr>
-          <w:rFonts w:asciiTheme="minorEastAsia" w:hAnsiTheme="minorEastAsia"/>
-          <w:sz w:val="20"/>
-          <w:szCs w:val="22"/>
-        </w:rPr>
-        <w:t>인플루언서</w:t>
-      </w:r>
-      <w:proofErr w:type="spellEnd"/>
-      <w:r>
-        <w:rPr>
-          <w:rFonts w:asciiTheme="minorEastAsia" w:hAnsiTheme="minorEastAsia"/>
-          <w:sz w:val="20"/>
-          <w:szCs w:val="22"/>
-        </w:rPr>
-        <w:t xml:space="preserve"> 동원력이 더 강력하다. Merz &amp; von Sikorski</w:t>
-      </w:r>
-      <w:r>
-        <w:rPr>
-          <w:rFonts w:asciiTheme="minorEastAsia" w:hAnsiTheme="minorEastAsia" w:hint="eastAsia"/>
-          <w:sz w:val="20"/>
-          <w:szCs w:val="22"/>
-        </w:rPr>
-        <w:t xml:space="preserve"> </w:t>
-      </w:r>
-      <w:r>
-        <w:rPr>
-          <w:rFonts w:asciiTheme="minorEastAsia" w:hAnsiTheme="minorEastAsia"/>
-          <w:sz w:val="20"/>
-          <w:szCs w:val="22"/>
-        </w:rPr>
-        <w:t xml:space="preserve">(2025)의 연구 맥락 역시 전 지구적 위기인 기후변화다. 위기 상황이나 강한 도덕적 분노가 수반되는 이슈는 </w:t>
-      </w:r>
-      <w:proofErr w:type="spellStart"/>
-      <w:r>
-        <w:rPr>
-          <w:rFonts w:asciiTheme="minorEastAsia" w:hAnsiTheme="minorEastAsia"/>
-          <w:sz w:val="20"/>
-          <w:szCs w:val="22"/>
-        </w:rPr>
-        <w:t>인플루언서</w:t>
-      </w:r>
-      <w:proofErr w:type="spellEnd"/>
-      <w:r>
-        <w:rPr>
-          <w:rFonts w:asciiTheme="minorEastAsia" w:hAnsiTheme="minorEastAsia"/>
-          <w:sz w:val="20"/>
-          <w:szCs w:val="22"/>
-        </w:rPr>
-        <w:t xml:space="preserve"> 생태계 내에서 폭발적인 속도와 압도적인 양으로 상호 참조되는 특성을 가진다. 수많은 근접 대중 여론 주도자(</w:t>
-      </w:r>
-      <w:proofErr w:type="spellStart"/>
-      <w:r>
-        <w:rPr>
-          <w:rFonts w:asciiTheme="minorEastAsia" w:hAnsiTheme="minorEastAsia"/>
-          <w:sz w:val="20"/>
-          <w:szCs w:val="22"/>
-        </w:rPr>
-        <w:t>ProMOL</w:t>
-      </w:r>
-      <w:proofErr w:type="spellEnd"/>
-      <w:r>
-        <w:rPr>
-          <w:rFonts w:asciiTheme="minorEastAsia" w:hAnsiTheme="minorEastAsia"/>
-          <w:sz w:val="20"/>
-          <w:szCs w:val="22"/>
-        </w:rPr>
-        <w:t xml:space="preserve">)가 다방향적 커뮤니케이션 흐름 속에서 동시다발적으로 목소리를 내고 서로의 메시지를 증폭시키는 거대한 사슬이 형성되어야만 대중의 집단적 효능감이 유의미하게 상승한다. 반면, 세금 정책이나 지역구 선거 같은 건조한 일상적 정치 이슈는 자발적이고 빠른 참조 사슬을 만들어내기 어려우므로, </w:t>
-      </w:r>
-      <w:proofErr w:type="spellStart"/>
-      <w:r>
-        <w:rPr>
-          <w:rFonts w:asciiTheme="minorEastAsia" w:hAnsiTheme="minorEastAsia"/>
-          <w:sz w:val="20"/>
-          <w:szCs w:val="22"/>
-        </w:rPr>
-        <w:t>인플루언서를</w:t>
-      </w:r>
-      <w:proofErr w:type="spellEnd"/>
-      <w:r>
-        <w:rPr>
-          <w:rFonts w:asciiTheme="minorEastAsia" w:hAnsiTheme="minorEastAsia"/>
-          <w:sz w:val="20"/>
-          <w:szCs w:val="22"/>
-        </w:rPr>
-        <w:t xml:space="preserve"> 단편적으로 동원하더라도 동원</w:t>
-      </w:r>
-      <w:r>
-        <w:rPr>
-          <w:rFonts w:asciiTheme="minorEastAsia" w:hAnsiTheme="minorEastAsia" w:hint="eastAsia"/>
-          <w:sz w:val="20"/>
-          <w:szCs w:val="22"/>
-        </w:rPr>
-        <w:t xml:space="preserve"> </w:t>
-      </w:r>
-      <w:r>
-        <w:rPr>
-          <w:rFonts w:asciiTheme="minorEastAsia" w:hAnsiTheme="minorEastAsia"/>
-          <w:sz w:val="20"/>
-          <w:szCs w:val="22"/>
-        </w:rPr>
-        <w:t>효과가 현저히 떨어질 것이</w:t>
-      </w:r>
-      <w:r>
-        <w:rPr>
-          <w:rFonts w:asciiTheme="minorEastAsia" w:hAnsiTheme="minorEastAsia" w:hint="eastAsia"/>
-          <w:sz w:val="20"/>
-          <w:szCs w:val="22"/>
-        </w:rPr>
-        <w:t>라고 가설을 세</w:t>
-      </w:r>
-      <w:r>
-        <w:rPr>
-          <w:rFonts w:asciiTheme="minorEastAsia" w:hAnsiTheme="minorEastAsia" w:hint="eastAsia"/>
-          <w:sz w:val="20"/>
-          <w:szCs w:val="22"/>
-        </w:rPr>
-        <w:t>우고 실증해볼 수 있을 것 같다.</w:t>
+          <w:rFonts w:asciiTheme="minorEastAsia" w:hAnsiTheme="minorEastAsia" w:hint="eastAsia"/>
+          <w:sz w:val="20"/>
+          <w:szCs w:val="22"/>
+        </w:rPr>
+        <w:t xml:space="preserve"> 느껴졌다. LLM의 자동화된 설득(automated </w:t>
+      </w:r>
+      <w:r>
+        <w:rPr>
+          <w:rFonts w:asciiTheme="minorEastAsia" w:hAnsiTheme="minorEastAsia"/>
+          <w:sz w:val="20"/>
+          <w:szCs w:val="22"/>
+        </w:rPr>
+        <w:t>persuasion</w:t>
+      </w:r>
+      <w:r>
+        <w:rPr>
+          <w:rFonts w:asciiTheme="minorEastAsia" w:hAnsiTheme="minorEastAsia" w:hint="eastAsia"/>
+          <w:sz w:val="20"/>
+          <w:szCs w:val="22"/>
+        </w:rPr>
+        <w:t xml:space="preserve">)이나, </w:t>
+      </w:r>
+      <w:r>
+        <w:rPr>
+          <w:rFonts w:asciiTheme="minorEastAsia" w:hAnsiTheme="minorEastAsia" w:hint="eastAsia"/>
+          <w:sz w:val="20"/>
+          <w:szCs w:val="22"/>
+        </w:rPr>
+        <w:t>AI의 가장 대표적인 분류(Classification)과 생성(Generation)을 바탕으로 거버넌스의 기술과 형태로 논의를 전개하는 방식 등에서 많은 인사이트를 얻었다.</w:t>
       </w:r>
     </w:p>
     <w:p>
       <w:pPr>
         <w:rPr>
           <w:rFonts w:asciiTheme="minorEastAsia" w:hAnsiTheme="minorEastAsia"/>
-          <w:sz w:val="20"/>
-          <w:szCs w:val="22"/>
-        </w:rPr>
-      </w:pPr>
-      <w:r>
-        <w:rPr>
-          <w:rFonts w:asciiTheme="minorEastAsia" w:hAnsiTheme="minorEastAsia"/>
-          <w:sz w:val="20"/>
-          <w:szCs w:val="22"/>
-        </w:rPr>
-        <w:t xml:space="preserve">셋째, Harff et al. (2025)이 지적한 'SMI-inspired celebrity'의 한계를 한국적 맥락과 결합하되, 앞서 논의한 '참조의 사슬' 개념을 교차 적용하면 더욱 입체적인 가설 도출이 가능하다. Harff 등은 </w:t>
+          <w:b/>
+          <w:bCs/>
+          <w:sz w:val="20"/>
+          <w:szCs w:val="22"/>
+        </w:rPr>
+      </w:pPr>
+      <w:r>
+        <w:rPr>
+          <w:rFonts w:asciiTheme="minorEastAsia" w:hAnsiTheme="minorEastAsia"/>
+          <w:b/>
+          <w:bCs/>
+          <w:sz w:val="20"/>
+          <w:szCs w:val="22"/>
+        </w:rPr>
+        <w:t>Q1.</w:t>
+      </w:r>
+      <w:r>
+        <w:rPr>
+          <w:rFonts w:asciiTheme="minorEastAsia" w:hAnsiTheme="minorEastAsia" w:hint="eastAsia"/>
+          <w:sz w:val="20"/>
+          <w:szCs w:val="22"/>
+        </w:rPr>
+        <w:t xml:space="preserve"> </w:t>
+      </w:r>
+      <w:r>
+        <w:rPr>
+          <w:rFonts w:asciiTheme="minorEastAsia" w:hAnsiTheme="minorEastAsia"/>
+          <w:sz w:val="20"/>
+          <w:szCs w:val="22"/>
+        </w:rPr>
+        <w:t xml:space="preserve">브라우저 확장 프로그램을 활용한 알고리즘 개입 방식이 소셜 미디어를 넘어 유튜브나 레거시 언론사의 뉴스 홈 화면 등에도 적용되었을 때, 텍스트가 아닌 영상 매체나 이미 </w:t>
       </w:r>
       <w:proofErr w:type="spellStart"/>
       <w:r>
@@ -1199,7 +873,7 @@
           <w:sz w:val="20"/>
           <w:szCs w:val="22"/>
         </w:rPr>
-        <w:t>DisMOL</w:t>
+        <w:t>게이트키핑을</w:t>
       </w:r>
       <w:proofErr w:type="spellEnd"/>
       <w:r>
@@ -1208,250 +882,48 @@
           <w:sz w:val="20"/>
           <w:szCs w:val="22"/>
         </w:rPr>
-        <w:t>이 소셜미디어의 개인화된 소통을 차용하더라도, 명성의 수직적 기원 때문에 대중과 구조적 거리감이 존재한다고 보았다. 이를 김종국, 하하 등 한국 유명 연예인들의 유튜브 진출 사례에 적용하면, 이들이 아무리 초상호작용적 관계를 흉내 내더라도 대중이 느끼는 도달 가능성(attainability)이 낮아, Merz &amp; von Sikorski (2025)가 다룬 '집단 행동 촉구'</w:t>
-      </w:r>
-      <w:proofErr w:type="spellStart"/>
-      <w:r>
-        <w:rPr>
-          <w:rFonts w:asciiTheme="minorEastAsia" w:hAnsiTheme="minorEastAsia"/>
-          <w:sz w:val="20"/>
-          <w:szCs w:val="22"/>
-        </w:rPr>
-        <w:t>에</w:t>
-      </w:r>
-      <w:proofErr w:type="spellEnd"/>
-      <w:r>
-        <w:rPr>
-          <w:rFonts w:asciiTheme="minorEastAsia" w:hAnsiTheme="minorEastAsia"/>
-          <w:sz w:val="20"/>
-          <w:szCs w:val="22"/>
-        </w:rPr>
-        <w:t xml:space="preserve"> 있어서는 순수 </w:t>
-      </w:r>
-      <w:proofErr w:type="spellStart"/>
-      <w:r>
-        <w:rPr>
-          <w:rFonts w:asciiTheme="minorEastAsia" w:hAnsiTheme="minorEastAsia"/>
-          <w:sz w:val="20"/>
-          <w:szCs w:val="22"/>
-        </w:rPr>
-        <w:t>ProMOL</w:t>
-      </w:r>
-      <w:proofErr w:type="spellEnd"/>
-      <w:r>
-        <w:rPr>
-          <w:rFonts w:asciiTheme="minorEastAsia" w:hAnsiTheme="minorEastAsia"/>
-          <w:sz w:val="20"/>
-          <w:szCs w:val="22"/>
-        </w:rPr>
-        <w:t>보다 동원력이 떨어질 것이라 일차적으로 예상할 수 있다.</w:t>
+        <w:t xml:space="preserve"> 거친 환경에서도 AAPA 억제가 사용자의 정서적 양극화 완화에 동일한 인과적 효과를 낼 수 있을까?</w:t>
+      </w:r>
+      <w:r>
+        <w:rPr>
+          <w:rFonts w:asciiTheme="minorEastAsia" w:hAnsiTheme="minorEastAsia" w:hint="eastAsia"/>
+          <w:sz w:val="20"/>
+          <w:szCs w:val="22"/>
+        </w:rPr>
+        <w:t>?</w:t>
       </w:r>
     </w:p>
     <w:p>
       <w:pPr>
         <w:rPr>
-          <w:rFonts w:asciiTheme="minorEastAsia" w:hAnsiTheme="minorEastAsia"/>
-          <w:sz w:val="20"/>
-          <w:szCs w:val="22"/>
-        </w:rPr>
-      </w:pPr>
-      <w:r>
-        <w:rPr>
-          <w:rFonts w:asciiTheme="minorEastAsia" w:hAnsiTheme="minorEastAsia"/>
-          <w:sz w:val="20"/>
-          <w:szCs w:val="22"/>
-        </w:rPr>
-        <w:t xml:space="preserve">하지만 이를 '참조의 사슬' 관점에서 비판적으로 뒤집어 볼 수 있다. </w:t>
-      </w:r>
-      <w:proofErr w:type="spellStart"/>
-      <w:r>
-        <w:rPr>
-          <w:rFonts w:asciiTheme="minorEastAsia" w:hAnsiTheme="minorEastAsia"/>
-          <w:sz w:val="20"/>
-          <w:szCs w:val="22"/>
-        </w:rPr>
-        <w:t>DisMOL</w:t>
-      </w:r>
-      <w:proofErr w:type="spellEnd"/>
-      <w:r>
-        <w:rPr>
-          <w:rFonts w:asciiTheme="minorEastAsia" w:hAnsiTheme="minorEastAsia"/>
-          <w:sz w:val="20"/>
-          <w:szCs w:val="22"/>
-        </w:rPr>
-        <w:t xml:space="preserve">의 메시지는 그 태생적 </w:t>
-      </w:r>
-      <w:proofErr w:type="spellStart"/>
-      <w:r>
-        <w:rPr>
-          <w:rFonts w:asciiTheme="minorEastAsia" w:hAnsiTheme="minorEastAsia"/>
-          <w:sz w:val="20"/>
-          <w:szCs w:val="22"/>
-        </w:rPr>
-        <w:t>수직성</w:t>
-      </w:r>
-      <w:proofErr w:type="spellEnd"/>
-      <w:r>
-        <w:rPr>
-          <w:rFonts w:asciiTheme="minorEastAsia" w:hAnsiTheme="minorEastAsia"/>
-          <w:sz w:val="20"/>
-          <w:szCs w:val="22"/>
-        </w:rPr>
-        <w:t>(</w:t>
-      </w:r>
-      <w:r>
-        <w:rPr>
-          <w:rFonts w:asciiTheme="minorEastAsia" w:hAnsiTheme="minorEastAsia" w:hint="eastAsia"/>
-          <w:sz w:val="20"/>
-          <w:szCs w:val="22"/>
-        </w:rPr>
-        <w:t>소속</w:t>
-      </w:r>
-      <w:r>
-        <w:rPr>
-          <w:rFonts w:asciiTheme="minorEastAsia" w:hAnsiTheme="minorEastAsia"/>
-          <w:sz w:val="20"/>
-          <w:szCs w:val="22"/>
-        </w:rPr>
-        <w:t>사와 편집팀의 존재</w:t>
-      </w:r>
-      <w:r>
-        <w:rPr>
-          <w:rFonts w:asciiTheme="minorEastAsia" w:hAnsiTheme="minorEastAsia" w:hint="eastAsia"/>
-          <w:sz w:val="20"/>
-          <w:szCs w:val="22"/>
-        </w:rPr>
-        <w:t>와 검수</w:t>
-      </w:r>
-      <w:r>
-        <w:rPr>
-          <w:rFonts w:asciiTheme="minorEastAsia" w:hAnsiTheme="minorEastAsia"/>
-          <w:sz w:val="20"/>
-          <w:szCs w:val="22"/>
-        </w:rPr>
-        <w:t xml:space="preserve">, 높은 사회적 지위로 인한 발언의 무게 등)으로 인해, 발화 그 자체만으로 이미 거대한 '참조의 사슬'이 압축 및 검증된 고밀도의 정보로 수용자에게 인식될 수 있다. 즉, </w:t>
-      </w:r>
-      <w:proofErr w:type="spellStart"/>
-      <w:r>
-        <w:rPr>
-          <w:rFonts w:asciiTheme="minorEastAsia" w:hAnsiTheme="minorEastAsia"/>
-          <w:sz w:val="20"/>
-          <w:szCs w:val="22"/>
-        </w:rPr>
-        <w:t>ProMOL</w:t>
-      </w:r>
-      <w:proofErr w:type="spellEnd"/>
-      <w:r>
-        <w:rPr>
-          <w:rFonts w:asciiTheme="minorEastAsia" w:hAnsiTheme="minorEastAsia"/>
-          <w:sz w:val="20"/>
-          <w:szCs w:val="22"/>
-        </w:rPr>
-        <w:t xml:space="preserve">이 수평적 '도달 가능성'을 무기로 틈새 유권자를 동원한다면, 소셜미디어로 진출한 </w:t>
-      </w:r>
-      <w:proofErr w:type="spellStart"/>
-      <w:r>
-        <w:rPr>
-          <w:rFonts w:asciiTheme="minorEastAsia" w:hAnsiTheme="minorEastAsia"/>
-          <w:sz w:val="20"/>
-          <w:szCs w:val="22"/>
-        </w:rPr>
-        <w:t>DisMOL</w:t>
-      </w:r>
-      <w:proofErr w:type="spellEnd"/>
-      <w:r>
-        <w:rPr>
-          <w:rFonts w:asciiTheme="minorEastAsia" w:hAnsiTheme="minorEastAsia"/>
-          <w:sz w:val="20"/>
-          <w:szCs w:val="22"/>
-        </w:rPr>
-        <w:t>은 '태생적이고 제도적인 신뢰성'</w:t>
-      </w:r>
-      <w:proofErr w:type="spellStart"/>
-      <w:r>
-        <w:rPr>
-          <w:rFonts w:asciiTheme="minorEastAsia" w:hAnsiTheme="minorEastAsia"/>
-          <w:sz w:val="20"/>
-          <w:szCs w:val="22"/>
-        </w:rPr>
-        <w:t>에</w:t>
-      </w:r>
-      <w:proofErr w:type="spellEnd"/>
-      <w:r>
-        <w:rPr>
-          <w:rFonts w:asciiTheme="minorEastAsia" w:hAnsiTheme="minorEastAsia"/>
-          <w:sz w:val="20"/>
-          <w:szCs w:val="22"/>
-        </w:rPr>
-        <w:t xml:space="preserve"> 소셜미디어 특유의 '</w:t>
-      </w:r>
-      <w:r>
-        <w:rPr>
-          <w:rFonts w:asciiTheme="minorEastAsia" w:hAnsiTheme="minorEastAsia" w:hint="eastAsia"/>
-          <w:sz w:val="20"/>
-          <w:szCs w:val="22"/>
-        </w:rPr>
-        <w:t>demi</w:t>
-      </w:r>
-      <w:r>
-        <w:rPr>
-          <w:rFonts w:asciiTheme="minorEastAsia" w:hAnsiTheme="minorEastAsia"/>
-          <w:sz w:val="20"/>
-          <w:szCs w:val="22"/>
-        </w:rPr>
-        <w:t xml:space="preserve">-친밀감'을 결합한 하이브리드 형태의 동원력을 행사할 수 있다. 이는 위기 상황의 정치적 동원에 있어 '나와 비슷한 평범한 사람의 친밀한 설득'과 '잃을 것이 많은 권위자의 안전한 보증' 중 어느 기제가 대중의 집단적 효능감을 더 강하게 </w:t>
-      </w:r>
-      <w:proofErr w:type="spellStart"/>
-      <w:r>
-        <w:rPr>
-          <w:rFonts w:asciiTheme="minorEastAsia" w:hAnsiTheme="minorEastAsia"/>
-          <w:sz w:val="20"/>
-          <w:szCs w:val="22"/>
-        </w:rPr>
-        <w:t>추동하는지</w:t>
-      </w:r>
-      <w:r>
-        <w:rPr>
-          <w:rFonts w:asciiTheme="minorEastAsia" w:hAnsiTheme="minorEastAsia"/>
-          <w:sz w:val="20"/>
-          <w:szCs w:val="22"/>
-        </w:rPr>
-        <w:t>와</w:t>
-      </w:r>
-      <w:proofErr w:type="spellEnd"/>
-      <w:r>
-        <w:rPr>
-          <w:rFonts w:asciiTheme="minorEastAsia" w:hAnsiTheme="minorEastAsia" w:hint="eastAsia"/>
-          <w:sz w:val="20"/>
-          <w:szCs w:val="22"/>
-        </w:rPr>
-        <w:t xml:space="preserve"> 연결될 것 같기도 하다.</w:t>
-      </w:r>
-    </w:p>
-    <w:p>
-      <w:pPr>
-        <w:rPr>
-          <w:rFonts w:asciiTheme="minorEastAsia" w:hAnsiTheme="minorEastAsia"/>
+          <w:rFonts w:asciiTheme="minorEastAsia" w:hAnsiTheme="minorEastAsia" w:hint="eastAsia"/>
+          <w:sz w:val="20"/>
+          <w:szCs w:val="22"/>
+        </w:rPr>
+      </w:pPr>
+      <w:r>
+        <w:rPr>
+          <w:rFonts w:asciiTheme="minorEastAsia" w:hAnsiTheme="minorEastAsia" w:hint="eastAsia"/>
           <w:b/>
           <w:bCs/>
           <w:sz w:val="20"/>
           <w:szCs w:val="22"/>
         </w:rPr>
-      </w:pPr>
-      <w:r>
-        <w:rPr>
-          <w:rFonts w:asciiTheme="minorEastAsia" w:hAnsiTheme="minorEastAsia"/>
-          <w:b/>
-          <w:bCs/>
-          <w:sz w:val="20"/>
-          <w:szCs w:val="22"/>
-        </w:rPr>
-        <w:lastRenderedPageBreak/>
-        <w:t>Q1.</w:t>
-      </w:r>
-      <w:r>
-        <w:rPr>
-          <w:rFonts w:asciiTheme="minorEastAsia" w:hAnsiTheme="minorEastAsia" w:hint="eastAsia"/>
+        <w:t xml:space="preserve">Q2. </w:t>
+      </w:r>
+      <w:proofErr w:type="spellStart"/>
+      <w:r>
+        <w:rPr>
+          <w:rFonts w:asciiTheme="minorEastAsia" w:hAnsiTheme="minorEastAsia"/>
+          <w:sz w:val="20"/>
+          <w:szCs w:val="22"/>
+        </w:rPr>
+        <w:t>하버마스</w:t>
+      </w:r>
+      <w:proofErr w:type="spellEnd"/>
+      <w:r>
+        <w:rPr>
+          <w:rFonts w:asciiTheme="minorEastAsia" w:hAnsiTheme="minorEastAsia"/>
           <w:sz w:val="20"/>
           <w:szCs w:val="22"/>
         </w:rPr>
@@ -1464,7 +936,7 @@
           <w:sz w:val="20"/>
           <w:szCs w:val="22"/>
         </w:rPr>
-        <w:t>하이프</w:t>
+        <w:t>머신은</w:t>
       </w:r>
       <w:proofErr w:type="spellEnd"/>
       <w:r>
@@ -1473,7 +945,7 @@
           <w:sz w:val="20"/>
           <w:szCs w:val="22"/>
         </w:rPr>
-        <w:t xml:space="preserve"> 하우스(Hype Houses)와 같은 </w:t>
+        <w:t xml:space="preserve"> 실험실 및 가상 시민 의회 환경에서 합의를 성공적으로 이끌어냈으나, 10주차에 다룬 '적극적 허위정보 수용자(active misinformed)'처럼 강한 </w:t>
       </w:r>
       <w:proofErr w:type="spellStart"/>
       <w:r>
@@ -1482,7 +954,7 @@
           <w:sz w:val="20"/>
           <w:szCs w:val="22"/>
         </w:rPr>
-        <w:t>인플루언서</w:t>
+        <w:t>내집단</w:t>
       </w:r>
       <w:proofErr w:type="spellEnd"/>
       <w:r>
@@ -1491,7 +963,7 @@
           <w:sz w:val="20"/>
           <w:szCs w:val="22"/>
         </w:rPr>
-        <w:t xml:space="preserve"> 집단 내부의 담합된 '좋아요'와 상호 공유가 '참조의 사슬(Chain of Reference)'로 기능하여 대중에게 반복 노출 효과와 가짜 신뢰성을 부여한다면, 이러한 인위적인 메시지 전파 과정을 디지털 시대의 새로운 '다단계 커뮤니케이션 흐름(multistep flow)'이나 건강한 '여론 주도(opinion leadership)'로 인정할 수 있는가? 나아가 민주주의 공론장에서 풀뿌리 운동과 여론 조작(astroturfing)을 구분하는 잣대를 단순히 '캠페인 측의 금전적 대가 지불 여부'</w:t>
+        <w:t xml:space="preserve"> 보호 동기(directional motivation)를 지닌 사람들에게도 이 AI가 도출한 '공통 기반'이 타협안으로 수용될 수 있을까? 환각이나 </w:t>
       </w:r>
       <w:proofErr w:type="spellStart"/>
       <w:r>
@@ -1500,7 +972,7 @@
           <w:sz w:val="20"/>
           <w:szCs w:val="22"/>
         </w:rPr>
-        <w:t>에만</w:t>
+        <w:t>팩트체크의</w:t>
       </w:r>
       <w:proofErr w:type="spellEnd"/>
       <w:r>
@@ -1509,15 +981,15 @@
           <w:sz w:val="20"/>
           <w:szCs w:val="22"/>
         </w:rPr>
-        <w:t xml:space="preserve"> 둘 것이 아니라, 이처럼 이익 공동체를 형성하여 알고리즘과 참조 빈도를 해킹하는 네트워크의 구조적 형태 자체로 확장해야 하는 것은 아</w:t>
-      </w:r>
-      <w:r>
-        <w:rPr>
-          <w:rFonts w:asciiTheme="minorEastAsia" w:hAnsiTheme="minorEastAsia" w:hint="eastAsia"/>
-          <w:sz w:val="20"/>
-          <w:szCs w:val="22"/>
-        </w:rPr>
-        <w:t xml:space="preserve">닐까? 그렇다면, 이를 </w:t>
+        <w:t xml:space="preserve"> 부재가 이들에게 AI 중재를 불신하게 만드는 빌미를 제공하</w:t>
+      </w:r>
+      <w:r>
+        <w:rPr>
+          <w:rFonts w:asciiTheme="minorEastAsia" w:hAnsiTheme="minorEastAsia" w:hint="eastAsia"/>
+          <w:sz w:val="20"/>
+          <w:szCs w:val="22"/>
+        </w:rPr>
+        <w:t xml:space="preserve">지는 않을까? 여기서 말하는 </w:t>
       </w:r>
       <w:r>
         <w:rPr>
@@ -1533,7 +1005,7 @@
           <w:sz w:val="20"/>
           <w:szCs w:val="22"/>
         </w:rPr>
-        <w:t>알고리즘 감사</w:t>
+        <w:t>불신하게 만드는 빌미</w:t>
       </w:r>
       <w:r>
         <w:rPr>
@@ -1549,7 +1021,25 @@
           <w:sz w:val="20"/>
           <w:szCs w:val="22"/>
         </w:rPr>
-        <w:t xml:space="preserve">의 영역으로 </w:t>
+        <w:t xml:space="preserve">와 관련해서, (1) 실제로 이것이 발생해서 이들이 AI 중재를 불신하게 </w:t>
+      </w:r>
+      <w:proofErr w:type="gramStart"/>
+      <w:r>
+        <w:rPr>
+          <w:rFonts w:asciiTheme="minorEastAsia" w:hAnsiTheme="minorEastAsia" w:hint="eastAsia"/>
+          <w:sz w:val="20"/>
+          <w:szCs w:val="22"/>
+        </w:rPr>
+        <w:t>만들거나</w:t>
+      </w:r>
+      <w:proofErr w:type="gramEnd"/>
+      <w:r>
+        <w:rPr>
+          <w:rFonts w:asciiTheme="minorEastAsia" w:hAnsiTheme="minorEastAsia" w:hint="eastAsia"/>
+          <w:sz w:val="20"/>
+          <w:szCs w:val="22"/>
+        </w:rPr>
+        <w:t xml:space="preserve">, 혹은 (2) 이것이 발생하지 않았음에도 자신의 동기화된 추론을 수호하기 위해 이를 </w:t>
       </w:r>
       <w:proofErr w:type="spellStart"/>
       <w:r>
@@ -1558,7 +1048,7 @@
           <w:sz w:val="20"/>
           <w:szCs w:val="22"/>
         </w:rPr>
-        <w:t>풀어내야할까</w:t>
+        <w:t>방패삼는</w:t>
       </w:r>
       <w:proofErr w:type="spellEnd"/>
       <w:r>
@@ -1567,338 +1057,7 @@
           <w:sz w:val="20"/>
           <w:szCs w:val="22"/>
         </w:rPr>
-        <w:t xml:space="preserve">, 아니면 </w:t>
-      </w:r>
-      <w:r>
-        <w:rPr>
-          <w:rFonts w:asciiTheme="minorEastAsia" w:hAnsiTheme="minorEastAsia"/>
-          <w:sz w:val="20"/>
-          <w:szCs w:val="22"/>
-        </w:rPr>
-        <w:t>‘</w:t>
-      </w:r>
-      <w:r>
-        <w:rPr>
-          <w:rFonts w:asciiTheme="minorEastAsia" w:hAnsiTheme="minorEastAsia" w:hint="eastAsia"/>
-          <w:sz w:val="20"/>
-          <w:szCs w:val="22"/>
-        </w:rPr>
-        <w:t>사용자에 대한 교육/제재</w:t>
-      </w:r>
-      <w:r>
-        <w:rPr>
-          <w:rFonts w:asciiTheme="minorEastAsia" w:hAnsiTheme="minorEastAsia"/>
-          <w:sz w:val="20"/>
-          <w:szCs w:val="22"/>
-        </w:rPr>
-        <w:t>’</w:t>
-      </w:r>
-      <w:r>
-        <w:rPr>
-          <w:rFonts w:asciiTheme="minorEastAsia" w:hAnsiTheme="minorEastAsia" w:hint="eastAsia"/>
-          <w:sz w:val="20"/>
-          <w:szCs w:val="22"/>
-        </w:rPr>
-        <w:t xml:space="preserve">의 영역으로 </w:t>
-      </w:r>
-      <w:proofErr w:type="spellStart"/>
-      <w:r>
-        <w:rPr>
-          <w:rFonts w:asciiTheme="minorEastAsia" w:hAnsiTheme="minorEastAsia" w:hint="eastAsia"/>
-          <w:sz w:val="20"/>
-          <w:szCs w:val="22"/>
-        </w:rPr>
-        <w:t>풀어내야할까</w:t>
-      </w:r>
-      <w:proofErr w:type="spellEnd"/>
-      <w:r>
-        <w:rPr>
-          <w:rFonts w:asciiTheme="minorEastAsia" w:hAnsiTheme="minorEastAsia" w:hint="eastAsia"/>
-          <w:sz w:val="20"/>
-          <w:szCs w:val="22"/>
-        </w:rPr>
-        <w:t>?</w:t>
-      </w:r>
-    </w:p>
-    <w:p>
-      <w:pPr>
-        <w:rPr>
-          <w:rFonts w:asciiTheme="minorEastAsia" w:hAnsiTheme="minorEastAsia"/>
-          <w:sz w:val="20"/>
-          <w:szCs w:val="22"/>
-        </w:rPr>
-      </w:pPr>
-      <w:r>
-        <w:rPr>
-          <w:rFonts w:asciiTheme="minorEastAsia" w:hAnsiTheme="minorEastAsia" w:hint="eastAsia"/>
-          <w:b/>
-          <w:bCs/>
-          <w:sz w:val="20"/>
-          <w:szCs w:val="22"/>
-        </w:rPr>
-        <w:t xml:space="preserve">Q2. </w:t>
-      </w:r>
-      <w:r>
-        <w:rPr>
-          <w:rFonts w:asciiTheme="minorEastAsia" w:hAnsiTheme="minorEastAsia"/>
-          <w:sz w:val="20"/>
-          <w:szCs w:val="22"/>
-        </w:rPr>
-        <w:t>Harff et al.</w:t>
-      </w:r>
-      <w:r>
-        <w:rPr>
-          <w:rFonts w:asciiTheme="minorEastAsia" w:hAnsiTheme="minorEastAsia" w:hint="eastAsia"/>
-          <w:sz w:val="20"/>
-          <w:szCs w:val="22"/>
-        </w:rPr>
-        <w:t xml:space="preserve"> </w:t>
-      </w:r>
-      <w:r>
-        <w:rPr>
-          <w:rFonts w:asciiTheme="minorEastAsia" w:hAnsiTheme="minorEastAsia"/>
-          <w:sz w:val="20"/>
-          <w:szCs w:val="22"/>
-        </w:rPr>
-        <w:t>(</w:t>
-      </w:r>
-      <w:proofErr w:type="gramStart"/>
-      <w:r>
-        <w:rPr>
-          <w:rFonts w:asciiTheme="minorEastAsia" w:hAnsiTheme="minorEastAsia"/>
-          <w:sz w:val="20"/>
-          <w:szCs w:val="22"/>
-        </w:rPr>
-        <w:t>2025)의</w:t>
-      </w:r>
-      <w:proofErr w:type="gramEnd"/>
-      <w:r>
-        <w:rPr>
-          <w:rFonts w:asciiTheme="minorEastAsia" w:hAnsiTheme="minorEastAsia"/>
-          <w:sz w:val="20"/>
-          <w:szCs w:val="22"/>
-        </w:rPr>
-        <w:t xml:space="preserve"> 유형론에 따르면 </w:t>
-      </w:r>
-      <w:proofErr w:type="spellStart"/>
-      <w:proofErr w:type="gramStart"/>
-      <w:r>
-        <w:rPr>
-          <w:rFonts w:asciiTheme="minorEastAsia" w:hAnsiTheme="minorEastAsia"/>
-          <w:sz w:val="20"/>
-          <w:szCs w:val="22"/>
-        </w:rPr>
-        <w:t>DisMOL</w:t>
-      </w:r>
-      <w:proofErr w:type="spellEnd"/>
-      <w:r>
-        <w:rPr>
-          <w:rFonts w:asciiTheme="minorEastAsia" w:hAnsiTheme="minorEastAsia"/>
-          <w:sz w:val="20"/>
-          <w:szCs w:val="22"/>
-        </w:rPr>
-        <w:t>(</w:t>
-      </w:r>
-      <w:proofErr w:type="gramEnd"/>
-      <w:r>
-        <w:rPr>
-          <w:rFonts w:asciiTheme="minorEastAsia" w:hAnsiTheme="minorEastAsia"/>
-          <w:sz w:val="20"/>
-          <w:szCs w:val="22"/>
-        </w:rPr>
-        <w:t xml:space="preserve">전통적 </w:t>
-      </w:r>
-      <w:proofErr w:type="gramStart"/>
-      <w:r>
-        <w:rPr>
-          <w:rFonts w:asciiTheme="minorEastAsia" w:hAnsiTheme="minorEastAsia"/>
-          <w:sz w:val="20"/>
-          <w:szCs w:val="22"/>
-        </w:rPr>
-        <w:t>연예인)이</w:t>
-      </w:r>
-      <w:proofErr w:type="gramEnd"/>
-      <w:r>
-        <w:rPr>
-          <w:rFonts w:asciiTheme="minorEastAsia" w:hAnsiTheme="minorEastAsia"/>
-          <w:sz w:val="20"/>
-          <w:szCs w:val="22"/>
-        </w:rPr>
-        <w:t xml:space="preserve"> </w:t>
-      </w:r>
-      <w:proofErr w:type="spellStart"/>
-      <w:r>
-        <w:rPr>
-          <w:rFonts w:asciiTheme="minorEastAsia" w:hAnsiTheme="minorEastAsia"/>
-          <w:sz w:val="20"/>
-          <w:szCs w:val="22"/>
-        </w:rPr>
-        <w:t>인플루언서의</w:t>
-      </w:r>
-      <w:proofErr w:type="spellEnd"/>
-      <w:r>
-        <w:rPr>
-          <w:rFonts w:asciiTheme="minorEastAsia" w:hAnsiTheme="minorEastAsia"/>
-          <w:sz w:val="20"/>
-          <w:szCs w:val="22"/>
-        </w:rPr>
-        <w:t xml:space="preserve"> </w:t>
-      </w:r>
-      <w:proofErr w:type="spellStart"/>
-      <w:r>
-        <w:rPr>
-          <w:rFonts w:asciiTheme="minorEastAsia" w:hAnsiTheme="minorEastAsia"/>
-          <w:sz w:val="20"/>
-          <w:szCs w:val="22"/>
-        </w:rPr>
-        <w:t>어포던스를</w:t>
-      </w:r>
-      <w:proofErr w:type="spellEnd"/>
-      <w:r>
-        <w:rPr>
-          <w:rFonts w:asciiTheme="minorEastAsia" w:hAnsiTheme="minorEastAsia"/>
-          <w:sz w:val="20"/>
-          <w:szCs w:val="22"/>
-        </w:rPr>
-        <w:t xml:space="preserve"> 흉내 내는 전략을 취하더라도, 획득한 지위의 기원이 다르기 때문에 대중이 느끼는 도달 가능성과 수평적 친밀감에는 차이가 발생</w:t>
-      </w:r>
-      <w:r>
-        <w:rPr>
-          <w:rFonts w:asciiTheme="minorEastAsia" w:hAnsiTheme="minorEastAsia" w:hint="eastAsia"/>
-          <w:sz w:val="20"/>
-          <w:szCs w:val="22"/>
-        </w:rPr>
-        <w:t>할 수 있</w:t>
-      </w:r>
-      <w:r>
-        <w:rPr>
-          <w:rFonts w:asciiTheme="minorEastAsia" w:hAnsiTheme="minorEastAsia"/>
-          <w:sz w:val="20"/>
-          <w:szCs w:val="22"/>
-        </w:rPr>
-        <w:t xml:space="preserve">다. 그렇다면, 기후변화와 같은 중대한 위기 상황에서 동일한 '집단적 반응 효능감' 메시지를 전달할 때, 순수하게 소셜미디어에서 성장한 </w:t>
-      </w:r>
-      <w:proofErr w:type="spellStart"/>
-      <w:r>
-        <w:rPr>
-          <w:rFonts w:asciiTheme="minorEastAsia" w:hAnsiTheme="minorEastAsia"/>
-          <w:sz w:val="20"/>
-          <w:szCs w:val="22"/>
-        </w:rPr>
-        <w:t>ProMOL</w:t>
-      </w:r>
-      <w:proofErr w:type="spellEnd"/>
-      <w:r>
-        <w:rPr>
-          <w:rFonts w:asciiTheme="minorEastAsia" w:hAnsiTheme="minorEastAsia"/>
-          <w:sz w:val="20"/>
-          <w:szCs w:val="22"/>
-        </w:rPr>
-        <w:t xml:space="preserve">이 전달하는 것과 </w:t>
-      </w:r>
-      <w:proofErr w:type="spellStart"/>
-      <w:r>
-        <w:rPr>
-          <w:rFonts w:asciiTheme="minorEastAsia" w:hAnsiTheme="minorEastAsia"/>
-          <w:sz w:val="20"/>
-          <w:szCs w:val="22"/>
-        </w:rPr>
-        <w:t>유튜버로</w:t>
-      </w:r>
-      <w:proofErr w:type="spellEnd"/>
-      <w:r>
-        <w:rPr>
-          <w:rFonts w:asciiTheme="minorEastAsia" w:hAnsiTheme="minorEastAsia"/>
-          <w:sz w:val="20"/>
-          <w:szCs w:val="22"/>
-        </w:rPr>
-        <w:t xml:space="preserve"> 전향한 매스미디어 연예인(</w:t>
-      </w:r>
-      <w:proofErr w:type="spellStart"/>
-      <w:r>
-        <w:rPr>
-          <w:rFonts w:asciiTheme="minorEastAsia" w:hAnsiTheme="minorEastAsia"/>
-          <w:sz w:val="20"/>
-          <w:szCs w:val="22"/>
-        </w:rPr>
-        <w:t>DisMOL</w:t>
-      </w:r>
-      <w:proofErr w:type="spellEnd"/>
-      <w:r>
-        <w:rPr>
-          <w:rFonts w:asciiTheme="minorEastAsia" w:hAnsiTheme="minorEastAsia"/>
-          <w:sz w:val="20"/>
-          <w:szCs w:val="22"/>
-        </w:rPr>
-        <w:t>)이 전달하는 것 중 어느 쪽이 대중의 실제 집단 행동 의도를 더 효과적으로 이끌어낼 것인가? 이</w:t>
-      </w:r>
-      <w:r>
-        <w:rPr>
-          <w:rFonts w:asciiTheme="minorEastAsia" w:hAnsiTheme="minorEastAsia" w:hint="eastAsia"/>
-          <w:sz w:val="20"/>
-          <w:szCs w:val="22"/>
-        </w:rPr>
-        <w:t xml:space="preserve"> 아이디어를 바탕으로</w:t>
-      </w:r>
-      <w:r>
-        <w:rPr>
-          <w:rFonts w:asciiTheme="minorEastAsia" w:hAnsiTheme="minorEastAsia"/>
-          <w:sz w:val="20"/>
-          <w:szCs w:val="22"/>
-        </w:rPr>
-        <w:t xml:space="preserve"> 메시지의 내용보다 발화자의 태생적 '</w:t>
-      </w:r>
-      <w:proofErr w:type="spellStart"/>
-      <w:r>
-        <w:rPr>
-          <w:rFonts w:asciiTheme="minorEastAsia" w:hAnsiTheme="minorEastAsia"/>
-          <w:sz w:val="20"/>
-          <w:szCs w:val="22"/>
-        </w:rPr>
-        <w:t>평범성</w:t>
-      </w:r>
-      <w:proofErr w:type="spellEnd"/>
-      <w:r>
-        <w:rPr>
-          <w:rFonts w:asciiTheme="minorEastAsia" w:hAnsiTheme="minorEastAsia"/>
-          <w:sz w:val="20"/>
-          <w:szCs w:val="22"/>
-        </w:rPr>
-        <w:t>'이 정치적 설득에 더 중요한 조건인지 묻는 실증적 연구</w:t>
-      </w:r>
-      <w:r>
-        <w:rPr>
-          <w:rFonts w:asciiTheme="minorEastAsia" w:hAnsiTheme="minorEastAsia" w:hint="eastAsia"/>
-          <w:sz w:val="20"/>
-          <w:szCs w:val="22"/>
-        </w:rPr>
-        <w:t xml:space="preserve">로 </w:t>
-      </w:r>
-      <w:proofErr w:type="spellStart"/>
-      <w:r>
-        <w:rPr>
-          <w:rFonts w:asciiTheme="minorEastAsia" w:hAnsiTheme="minorEastAsia" w:hint="eastAsia"/>
-          <w:sz w:val="20"/>
-          <w:szCs w:val="22"/>
-        </w:rPr>
-        <w:t>확장시킬</w:t>
-      </w:r>
-      <w:proofErr w:type="spellEnd"/>
-      <w:r>
-        <w:rPr>
-          <w:rFonts w:asciiTheme="minorEastAsia" w:hAnsiTheme="minorEastAsia" w:hint="eastAsia"/>
-          <w:sz w:val="20"/>
-          <w:szCs w:val="22"/>
-        </w:rPr>
-        <w:t xml:space="preserve"> 수 있을까</w:t>
-      </w:r>
-      <w:r>
-        <w:rPr>
-          <w:rFonts w:asciiTheme="minorEastAsia" w:hAnsiTheme="minorEastAsia"/>
-          <w:sz w:val="20"/>
-          <w:szCs w:val="22"/>
-        </w:rPr>
-        <w:t>?</w:t>
+        <w:t xml:space="preserve"> 두 경우에 대해 각각 궁금하다.</w:t>
       </w:r>
     </w:p>
     <w:p>
@@ -1953,7 +1112,7 @@
       <w:pPr>
         <w:ind w:left="720" w:hangingChars="300" w:hanging="720"/>
         <w:rPr>
-          <w:rFonts w:ascii="Times New Roman" w:hAnsi="Times New Roman" w:cs="Times New Roman" w:hint="eastAsia"/>
+          <w:rFonts w:ascii="Times New Roman" w:hAnsi="Times New Roman" w:cs="Times New Roman"/>
           <w:sz w:val="24"/>
         </w:rPr>
       </w:pPr>
@@ -2063,17 +1222,8 @@
     </w:p>
     <w:p>
       <w:pPr>
-        <w:ind w:left="660" w:hangingChars="300" w:hanging="660"/>
-        <w:rPr>
-          <w:rFonts w:ascii="Times New Roman" w:hAnsi="Times New Roman" w:cs="Times New Roman"/>
-          <w:szCs w:val="22"/>
-        </w:rPr>
-      </w:pPr>
-    </w:p>
-    <w:p>
-      <w:pPr>
-        <w:rPr>
-          <w:rFonts w:ascii="Times New Roman" w:hAnsi="Times New Roman" w:cs="Times New Roman"/>
+        <w:rPr>
+          <w:rFonts w:ascii="Times New Roman" w:hAnsi="Times New Roman" w:cs="Times New Roman" w:hint="eastAsia"/>
           <w:sz w:val="24"/>
         </w:rPr>
       </w:pPr>

</xml_diff>